<commit_message>
docs(signoff): show Spec C admin/access block once, not per section
The 4 file editors and the SharePoint permission model are identical for
all 6 datasets, so the admin list + access paragraph now render only in
Spec C-1 (reworded to "ทั้ง 6 ชุดนี้") instead of repeating in every
section. Generator emits the block on first call only.

Co-Authored-By: Claude Sonnet 5 <noreply@anthropic.com>
</commit_message>
<xml_diff>
--- a/requirement_spec/1_software_dev/1.1_frontend/signoff_spec/laddawan/Spec C การจัดการตารางข้อมูลหลัก_V1.0.docx
+++ b/requirement_spec/1_software_dev/1.1_frontend/signoff_spec/laddawan/Spec C การจัดการตารางข้อมูลหลัก_V1.0.docx
@@ -290,7 +290,7 @@
           <w:sz w:val="24"/>
           <w:szCs w:val="24"/>
         </w:rPr>
-        <w:t xml:space="preserve">การเข้าถึงและสิทธิ์แก้ไขไฟล์ควบคุมด้วยสิทธิ์ของไฟล์/โฟลเดอร์บน SharePoint (site CMANDWPRD) โดยตรง เฉพาะผู้ที่ได้รับสิทธิ์ข้างต้นเท่านั้นที่แก้ไขไฟล์ได้ ทั้งนี้ SharePoint บันทึกประวัติการแก้ไข (version history) ของไฟล์ให้อัตโนมัติ</w:t>
+        <w:t xml:space="preserve">การเข้าถึงและสิทธิ์แก้ไขไฟล์ทั้ง 6 ชุดนี้ควบคุมด้วยสิทธิ์ของไฟล์/โฟลเดอร์บน SharePoint (site CMANDWPRD) โดยตรง เฉพาะผู้ที่ได้รับสิทธิ์ข้างต้นเท่านั้นที่แก้ไขไฟล์ได้ ทั้งนี้ SharePoint บันทึกประวัติการแก้ไข (version history) ของไฟล์ให้อัตโนมัติ</w:t>
       </w:r>
     </w:p>
     <w:p>
@@ -802,93 +802,6 @@
     <w:p>
       <w:pPr>
         <w:rFonts w:ascii="Leelawadee UI" w:hAnsi="Leelawadee UI" w:cs="Leelawadee UI"/>
-        <w:spacing w:before="100" w:after="40"/>
-      </w:pPr>
-      <w:r>
-        <w:rPr>
-          <w:rFonts w:ascii="Leelawadee UI" w:hAnsi="Leelawadee UI" w:cs="Leelawadee UI"/>
-          <w:b/>
-          <w:bCs/>
-          <w:color w:val="000000"/>
-          <w:sz w:val="24"/>
-          <w:szCs w:val="24"/>
-        </w:rPr>
-        <w:t xml:space="preserve">ผู้ที่ได้รับสิทธิ์แก้ไขไฟล์ Excel บน SharePoint (4 คน)</w:t>
-      </w:r>
-    </w:p>
-    <w:p>
-      <w:pPr>
-        <w:rFonts w:ascii="Leelawadee UI" w:hAnsi="Leelawadee UI" w:cs="Leelawadee UI"/>
-        <w:spacing w:before="0" w:after="50"/>
-      </w:pPr>
-      <w:r>
-        <w:rPr>
-          <w:rFonts w:ascii="Leelawadee UI" w:hAnsi="Leelawadee UI" w:cs="Leelawadee UI"/>
-          <w:sz w:val="24"/>
-          <w:szCs w:val="24"/>
-        </w:rPr>
-        <w:t xml:space="preserve">•  นิภาพร ทองกิ่ง — nipapornt@chememan.com</w:t>
-      </w:r>
-    </w:p>
-    <w:p>
-      <w:pPr>
-        <w:rFonts w:ascii="Leelawadee UI" w:hAnsi="Leelawadee UI" w:cs="Leelawadee UI"/>
-        <w:spacing w:before="0" w:after="50"/>
-      </w:pPr>
-      <w:r>
-        <w:rPr>
-          <w:rFonts w:ascii="Leelawadee UI" w:hAnsi="Leelawadee UI" w:cs="Leelawadee UI"/>
-          <w:sz w:val="24"/>
-          <w:szCs w:val="24"/>
-        </w:rPr>
-        <w:t xml:space="preserve">•  วราพร ติรสิทธิ์ — warapornt@chememan.com</w:t>
-      </w:r>
-    </w:p>
-    <w:p>
-      <w:pPr>
-        <w:rFonts w:ascii="Leelawadee UI" w:hAnsi="Leelawadee UI" w:cs="Leelawadee UI"/>
-        <w:spacing w:before="0" w:after="50"/>
-      </w:pPr>
-      <w:r>
-        <w:rPr>
-          <w:rFonts w:ascii="Leelawadee UI" w:hAnsi="Leelawadee UI" w:cs="Leelawadee UI"/>
-          <w:sz w:val="24"/>
-          <w:szCs w:val="24"/>
-        </w:rPr>
-        <w:t xml:space="preserve">•  ปิยะดา ดวงพลจันทร์ — piyadad@chememan.com</w:t>
-      </w:r>
-    </w:p>
-    <w:p>
-      <w:pPr>
-        <w:rFonts w:ascii="Leelawadee UI" w:hAnsi="Leelawadee UI" w:cs="Leelawadee UI"/>
-        <w:spacing w:before="0" w:after="50"/>
-      </w:pPr>
-      <w:r>
-        <w:rPr>
-          <w:rFonts w:ascii="Leelawadee UI" w:hAnsi="Leelawadee UI" w:cs="Leelawadee UI"/>
-          <w:sz w:val="24"/>
-          <w:szCs w:val="24"/>
-        </w:rPr>
-        <w:t xml:space="preserve">•  ทีม Data and Analytics — jakkaritw@chememan.com</w:t>
-      </w:r>
-    </w:p>
-    <w:p>
-      <w:pPr>
-        <w:rFonts w:ascii="Leelawadee UI" w:hAnsi="Leelawadee UI" w:cs="Leelawadee UI"/>
-        <w:spacing w:before="0" w:after="140"/>
-      </w:pPr>
-      <w:r>
-        <w:rPr>
-          <w:rFonts w:ascii="Leelawadee UI" w:hAnsi="Leelawadee UI" w:cs="Leelawadee UI"/>
-          <w:sz w:val="24"/>
-          <w:szCs w:val="24"/>
-        </w:rPr>
-        <w:t xml:space="preserve">การเข้าถึงและสิทธิ์แก้ไขไฟล์ควบคุมด้วยสิทธิ์ของไฟล์/โฟลเดอร์บน SharePoint (site CMANDWPRD) โดยตรง เฉพาะผู้ที่ได้รับสิทธิ์ข้างต้นเท่านั้นที่แก้ไขไฟล์ได้ ทั้งนี้ SharePoint บันทึกประวัติการแก้ไข (version history) ของไฟล์ให้อัตโนมัติ</w:t>
-      </w:r>
-    </w:p>
-    <w:p>
-      <w:pPr>
-        <w:rFonts w:ascii="Leelawadee UI" w:hAnsi="Leelawadee UI" w:cs="Leelawadee UI"/>
         <w:spacing w:before="160" w:after="60"/>
         <w:keepNext/>
       </w:pPr>
@@ -1427,93 +1340,6 @@
     <w:p>
       <w:pPr>
         <w:rFonts w:ascii="Leelawadee UI" w:hAnsi="Leelawadee UI" w:cs="Leelawadee UI"/>
-        <w:spacing w:before="100" w:after="40"/>
-      </w:pPr>
-      <w:r>
-        <w:rPr>
-          <w:rFonts w:ascii="Leelawadee UI" w:hAnsi="Leelawadee UI" w:cs="Leelawadee UI"/>
-          <w:b/>
-          <w:bCs/>
-          <w:color w:val="000000"/>
-          <w:sz w:val="24"/>
-          <w:szCs w:val="24"/>
-        </w:rPr>
-        <w:t xml:space="preserve">ผู้ที่ได้รับสิทธิ์แก้ไขไฟล์ Excel บน SharePoint (4 คน)</w:t>
-      </w:r>
-    </w:p>
-    <w:p>
-      <w:pPr>
-        <w:rFonts w:ascii="Leelawadee UI" w:hAnsi="Leelawadee UI" w:cs="Leelawadee UI"/>
-        <w:spacing w:before="0" w:after="50"/>
-      </w:pPr>
-      <w:r>
-        <w:rPr>
-          <w:rFonts w:ascii="Leelawadee UI" w:hAnsi="Leelawadee UI" w:cs="Leelawadee UI"/>
-          <w:sz w:val="24"/>
-          <w:szCs w:val="24"/>
-        </w:rPr>
-        <w:t xml:space="preserve">•  นิภาพร ทองกิ่ง — nipapornt@chememan.com</w:t>
-      </w:r>
-    </w:p>
-    <w:p>
-      <w:pPr>
-        <w:rFonts w:ascii="Leelawadee UI" w:hAnsi="Leelawadee UI" w:cs="Leelawadee UI"/>
-        <w:spacing w:before="0" w:after="50"/>
-      </w:pPr>
-      <w:r>
-        <w:rPr>
-          <w:rFonts w:ascii="Leelawadee UI" w:hAnsi="Leelawadee UI" w:cs="Leelawadee UI"/>
-          <w:sz w:val="24"/>
-          <w:szCs w:val="24"/>
-        </w:rPr>
-        <w:t xml:space="preserve">•  วราพร ติรสิทธิ์ — warapornt@chememan.com</w:t>
-      </w:r>
-    </w:p>
-    <w:p>
-      <w:pPr>
-        <w:rFonts w:ascii="Leelawadee UI" w:hAnsi="Leelawadee UI" w:cs="Leelawadee UI"/>
-        <w:spacing w:before="0" w:after="50"/>
-      </w:pPr>
-      <w:r>
-        <w:rPr>
-          <w:rFonts w:ascii="Leelawadee UI" w:hAnsi="Leelawadee UI" w:cs="Leelawadee UI"/>
-          <w:sz w:val="24"/>
-          <w:szCs w:val="24"/>
-        </w:rPr>
-        <w:t xml:space="preserve">•  ปิยะดา ดวงพลจันทร์ — piyadad@chememan.com</w:t>
-      </w:r>
-    </w:p>
-    <w:p>
-      <w:pPr>
-        <w:rFonts w:ascii="Leelawadee UI" w:hAnsi="Leelawadee UI" w:cs="Leelawadee UI"/>
-        <w:spacing w:before="0" w:after="50"/>
-      </w:pPr>
-      <w:r>
-        <w:rPr>
-          <w:rFonts w:ascii="Leelawadee UI" w:hAnsi="Leelawadee UI" w:cs="Leelawadee UI"/>
-          <w:sz w:val="24"/>
-          <w:szCs w:val="24"/>
-        </w:rPr>
-        <w:t xml:space="preserve">•  ทีม Data and Analytics — jakkaritw@chememan.com</w:t>
-      </w:r>
-    </w:p>
-    <w:p>
-      <w:pPr>
-        <w:rFonts w:ascii="Leelawadee UI" w:hAnsi="Leelawadee UI" w:cs="Leelawadee UI"/>
-        <w:spacing w:before="0" w:after="140"/>
-      </w:pPr>
-      <w:r>
-        <w:rPr>
-          <w:rFonts w:ascii="Leelawadee UI" w:hAnsi="Leelawadee UI" w:cs="Leelawadee UI"/>
-          <w:sz w:val="24"/>
-          <w:szCs w:val="24"/>
-        </w:rPr>
-        <w:t xml:space="preserve">การเข้าถึงและสิทธิ์แก้ไขไฟล์ควบคุมด้วยสิทธิ์ของไฟล์/โฟลเดอร์บน SharePoint (site CMANDWPRD) โดยตรง เฉพาะผู้ที่ได้รับสิทธิ์ข้างต้นเท่านั้นที่แก้ไขไฟล์ได้ ทั้งนี้ SharePoint บันทึกประวัติการแก้ไข (version history) ของไฟล์ให้อัตโนมัติ</w:t>
-      </w:r>
-    </w:p>
-    <w:p>
-      <w:pPr>
-        <w:rFonts w:ascii="Leelawadee UI" w:hAnsi="Leelawadee UI" w:cs="Leelawadee UI"/>
         <w:spacing w:before="160" w:after="60"/>
         <w:keepNext/>
       </w:pPr>
@@ -2006,93 +1832,6 @@
     <w:p>
       <w:pPr>
         <w:rFonts w:ascii="Leelawadee UI" w:hAnsi="Leelawadee UI" w:cs="Leelawadee UI"/>
-        <w:spacing w:before="100" w:after="40"/>
-      </w:pPr>
-      <w:r>
-        <w:rPr>
-          <w:rFonts w:ascii="Leelawadee UI" w:hAnsi="Leelawadee UI" w:cs="Leelawadee UI"/>
-          <w:b/>
-          <w:bCs/>
-          <w:color w:val="000000"/>
-          <w:sz w:val="24"/>
-          <w:szCs w:val="24"/>
-        </w:rPr>
-        <w:t xml:space="preserve">ผู้ที่ได้รับสิทธิ์แก้ไขไฟล์ Excel บน SharePoint (4 คน)</w:t>
-      </w:r>
-    </w:p>
-    <w:p>
-      <w:pPr>
-        <w:rFonts w:ascii="Leelawadee UI" w:hAnsi="Leelawadee UI" w:cs="Leelawadee UI"/>
-        <w:spacing w:before="0" w:after="50"/>
-      </w:pPr>
-      <w:r>
-        <w:rPr>
-          <w:rFonts w:ascii="Leelawadee UI" w:hAnsi="Leelawadee UI" w:cs="Leelawadee UI"/>
-          <w:sz w:val="24"/>
-          <w:szCs w:val="24"/>
-        </w:rPr>
-        <w:t xml:space="preserve">•  นิภาพร ทองกิ่ง — nipapornt@chememan.com</w:t>
-      </w:r>
-    </w:p>
-    <w:p>
-      <w:pPr>
-        <w:rFonts w:ascii="Leelawadee UI" w:hAnsi="Leelawadee UI" w:cs="Leelawadee UI"/>
-        <w:spacing w:before="0" w:after="50"/>
-      </w:pPr>
-      <w:r>
-        <w:rPr>
-          <w:rFonts w:ascii="Leelawadee UI" w:hAnsi="Leelawadee UI" w:cs="Leelawadee UI"/>
-          <w:sz w:val="24"/>
-          <w:szCs w:val="24"/>
-        </w:rPr>
-        <w:t xml:space="preserve">•  วราพร ติรสิทธิ์ — warapornt@chememan.com</w:t>
-      </w:r>
-    </w:p>
-    <w:p>
-      <w:pPr>
-        <w:rFonts w:ascii="Leelawadee UI" w:hAnsi="Leelawadee UI" w:cs="Leelawadee UI"/>
-        <w:spacing w:before="0" w:after="50"/>
-      </w:pPr>
-      <w:r>
-        <w:rPr>
-          <w:rFonts w:ascii="Leelawadee UI" w:hAnsi="Leelawadee UI" w:cs="Leelawadee UI"/>
-          <w:sz w:val="24"/>
-          <w:szCs w:val="24"/>
-        </w:rPr>
-        <w:t xml:space="preserve">•  ปิยะดา ดวงพลจันทร์ — piyadad@chememan.com</w:t>
-      </w:r>
-    </w:p>
-    <w:p>
-      <w:pPr>
-        <w:rFonts w:ascii="Leelawadee UI" w:hAnsi="Leelawadee UI" w:cs="Leelawadee UI"/>
-        <w:spacing w:before="0" w:after="50"/>
-      </w:pPr>
-      <w:r>
-        <w:rPr>
-          <w:rFonts w:ascii="Leelawadee UI" w:hAnsi="Leelawadee UI" w:cs="Leelawadee UI"/>
-          <w:sz w:val="24"/>
-          <w:szCs w:val="24"/>
-        </w:rPr>
-        <w:t xml:space="preserve">•  ทีม Data and Analytics — jakkaritw@chememan.com</w:t>
-      </w:r>
-    </w:p>
-    <w:p>
-      <w:pPr>
-        <w:rFonts w:ascii="Leelawadee UI" w:hAnsi="Leelawadee UI" w:cs="Leelawadee UI"/>
-        <w:spacing w:before="0" w:after="140"/>
-      </w:pPr>
-      <w:r>
-        <w:rPr>
-          <w:rFonts w:ascii="Leelawadee UI" w:hAnsi="Leelawadee UI" w:cs="Leelawadee UI"/>
-          <w:sz w:val="24"/>
-          <w:szCs w:val="24"/>
-        </w:rPr>
-        <w:t xml:space="preserve">การเข้าถึงและสิทธิ์แก้ไขไฟล์ควบคุมด้วยสิทธิ์ของไฟล์/โฟลเดอร์บน SharePoint (site CMANDWPRD) โดยตรง เฉพาะผู้ที่ได้รับสิทธิ์ข้างต้นเท่านั้นที่แก้ไขไฟล์ได้ ทั้งนี้ SharePoint บันทึกประวัติการแก้ไข (version history) ของไฟล์ให้อัตโนมัติ</w:t>
-      </w:r>
-    </w:p>
-    <w:p>
-      <w:pPr>
-        <w:rFonts w:ascii="Leelawadee UI" w:hAnsi="Leelawadee UI" w:cs="Leelawadee UI"/>
         <w:spacing w:before="160" w:after="60"/>
         <w:keepNext/>
       </w:pPr>
@@ -2711,93 +2450,6 @@
     <w:p>
       <w:pPr>
         <w:rFonts w:ascii="Leelawadee UI" w:hAnsi="Leelawadee UI" w:cs="Leelawadee UI"/>
-        <w:spacing w:before="100" w:after="40"/>
-      </w:pPr>
-      <w:r>
-        <w:rPr>
-          <w:rFonts w:ascii="Leelawadee UI" w:hAnsi="Leelawadee UI" w:cs="Leelawadee UI"/>
-          <w:b/>
-          <w:bCs/>
-          <w:color w:val="000000"/>
-          <w:sz w:val="24"/>
-          <w:szCs w:val="24"/>
-        </w:rPr>
-        <w:t xml:space="preserve">ผู้ที่ได้รับสิทธิ์แก้ไขไฟล์ Excel บน SharePoint (4 คน)</w:t>
-      </w:r>
-    </w:p>
-    <w:p>
-      <w:pPr>
-        <w:rFonts w:ascii="Leelawadee UI" w:hAnsi="Leelawadee UI" w:cs="Leelawadee UI"/>
-        <w:spacing w:before="0" w:after="50"/>
-      </w:pPr>
-      <w:r>
-        <w:rPr>
-          <w:rFonts w:ascii="Leelawadee UI" w:hAnsi="Leelawadee UI" w:cs="Leelawadee UI"/>
-          <w:sz w:val="24"/>
-          <w:szCs w:val="24"/>
-        </w:rPr>
-        <w:t xml:space="preserve">•  นิภาพร ทองกิ่ง — nipapornt@chememan.com</w:t>
-      </w:r>
-    </w:p>
-    <w:p>
-      <w:pPr>
-        <w:rFonts w:ascii="Leelawadee UI" w:hAnsi="Leelawadee UI" w:cs="Leelawadee UI"/>
-        <w:spacing w:before="0" w:after="50"/>
-      </w:pPr>
-      <w:r>
-        <w:rPr>
-          <w:rFonts w:ascii="Leelawadee UI" w:hAnsi="Leelawadee UI" w:cs="Leelawadee UI"/>
-          <w:sz w:val="24"/>
-          <w:szCs w:val="24"/>
-        </w:rPr>
-        <w:t xml:space="preserve">•  วราพร ติรสิทธิ์ — warapornt@chememan.com</w:t>
-      </w:r>
-    </w:p>
-    <w:p>
-      <w:pPr>
-        <w:rFonts w:ascii="Leelawadee UI" w:hAnsi="Leelawadee UI" w:cs="Leelawadee UI"/>
-        <w:spacing w:before="0" w:after="50"/>
-      </w:pPr>
-      <w:r>
-        <w:rPr>
-          <w:rFonts w:ascii="Leelawadee UI" w:hAnsi="Leelawadee UI" w:cs="Leelawadee UI"/>
-          <w:sz w:val="24"/>
-          <w:szCs w:val="24"/>
-        </w:rPr>
-        <w:t xml:space="preserve">•  ปิยะดา ดวงพลจันทร์ — piyadad@chememan.com</w:t>
-      </w:r>
-    </w:p>
-    <w:p>
-      <w:pPr>
-        <w:rFonts w:ascii="Leelawadee UI" w:hAnsi="Leelawadee UI" w:cs="Leelawadee UI"/>
-        <w:spacing w:before="0" w:after="50"/>
-      </w:pPr>
-      <w:r>
-        <w:rPr>
-          <w:rFonts w:ascii="Leelawadee UI" w:hAnsi="Leelawadee UI" w:cs="Leelawadee UI"/>
-          <w:sz w:val="24"/>
-          <w:szCs w:val="24"/>
-        </w:rPr>
-        <w:t xml:space="preserve">•  ทีม Data and Analytics — jakkaritw@chememan.com</w:t>
-      </w:r>
-    </w:p>
-    <w:p>
-      <w:pPr>
-        <w:rFonts w:ascii="Leelawadee UI" w:hAnsi="Leelawadee UI" w:cs="Leelawadee UI"/>
-        <w:spacing w:before="0" w:after="140"/>
-      </w:pPr>
-      <w:r>
-        <w:rPr>
-          <w:rFonts w:ascii="Leelawadee UI" w:hAnsi="Leelawadee UI" w:cs="Leelawadee UI"/>
-          <w:sz w:val="24"/>
-          <w:szCs w:val="24"/>
-        </w:rPr>
-        <w:t xml:space="preserve">การเข้าถึงและสิทธิ์แก้ไขไฟล์ควบคุมด้วยสิทธิ์ของไฟล์/โฟลเดอร์บน SharePoint (site CMANDWPRD) โดยตรง เฉพาะผู้ที่ได้รับสิทธิ์ข้างต้นเท่านั้นที่แก้ไขไฟล์ได้ ทั้งนี้ SharePoint บันทึกประวัติการแก้ไข (version history) ของไฟล์ให้อัตโนมัติ</w:t>
-      </w:r>
-    </w:p>
-    <w:p>
-      <w:pPr>
-        <w:rFonts w:ascii="Leelawadee UI" w:hAnsi="Leelawadee UI" w:cs="Leelawadee UI"/>
         <w:spacing w:before="160" w:after="60"/>
         <w:keepNext/>
       </w:pPr>
@@ -3859,93 +3511,6 @@
           <w:szCs w:val="24"/>
         </w:rPr>
         <w:t xml:space="preserve">ข้อมูลชุดนี้กำหนดว่าแต่ละ Cost Center ใครมีสิทธิ์กรอก (fill) ข้อมูลงบประมาณของ Cost Center นั้น และใครมีสิทธิ์มองเห็น (see) เป็นแหล่งข้อมูลเดียว (single source of truth) สำหรับสิทธิ์ การมองเห็นและการกรอกข้อมูลในระบบงบประมาณหลัก การถูกระบุเป็นผู้กรอกของ Cost Center ใด จะได้สิทธิ์กรอกของ Cost Center นั้นโดยตรง ไม่มีการตรวจสอบระดับตำแหน่งหรือ role เพิ่มเติม ผู้ดูแลระบบดูแลข้อมูลนี้ผ่านไฟล์ Excel หนึ่งไฟล์บน SharePoint</w:t>
-      </w:r>
-    </w:p>
-    <w:p>
-      <w:pPr>
-        <w:rFonts w:ascii="Leelawadee UI" w:hAnsi="Leelawadee UI" w:cs="Leelawadee UI"/>
-        <w:spacing w:before="100" w:after="40"/>
-      </w:pPr>
-      <w:r>
-        <w:rPr>
-          <w:rFonts w:ascii="Leelawadee UI" w:hAnsi="Leelawadee UI" w:cs="Leelawadee UI"/>
-          <w:b/>
-          <w:bCs/>
-          <w:color w:val="000000"/>
-          <w:sz w:val="24"/>
-          <w:szCs w:val="24"/>
-        </w:rPr>
-        <w:t xml:space="preserve">ผู้ที่ได้รับสิทธิ์แก้ไขไฟล์ Excel บน SharePoint (4 คน)</w:t>
-      </w:r>
-    </w:p>
-    <w:p>
-      <w:pPr>
-        <w:rFonts w:ascii="Leelawadee UI" w:hAnsi="Leelawadee UI" w:cs="Leelawadee UI"/>
-        <w:spacing w:before="0" w:after="50"/>
-      </w:pPr>
-      <w:r>
-        <w:rPr>
-          <w:rFonts w:ascii="Leelawadee UI" w:hAnsi="Leelawadee UI" w:cs="Leelawadee UI"/>
-          <w:sz w:val="24"/>
-          <w:szCs w:val="24"/>
-        </w:rPr>
-        <w:t xml:space="preserve">•  นิภาพร ทองกิ่ง — nipapornt@chememan.com</w:t>
-      </w:r>
-    </w:p>
-    <w:p>
-      <w:pPr>
-        <w:rFonts w:ascii="Leelawadee UI" w:hAnsi="Leelawadee UI" w:cs="Leelawadee UI"/>
-        <w:spacing w:before="0" w:after="50"/>
-      </w:pPr>
-      <w:r>
-        <w:rPr>
-          <w:rFonts w:ascii="Leelawadee UI" w:hAnsi="Leelawadee UI" w:cs="Leelawadee UI"/>
-          <w:sz w:val="24"/>
-          <w:szCs w:val="24"/>
-        </w:rPr>
-        <w:t xml:space="preserve">•  วราพร ติรสิทธิ์ — warapornt@chememan.com</w:t>
-      </w:r>
-    </w:p>
-    <w:p>
-      <w:pPr>
-        <w:rFonts w:ascii="Leelawadee UI" w:hAnsi="Leelawadee UI" w:cs="Leelawadee UI"/>
-        <w:spacing w:before="0" w:after="50"/>
-      </w:pPr>
-      <w:r>
-        <w:rPr>
-          <w:rFonts w:ascii="Leelawadee UI" w:hAnsi="Leelawadee UI" w:cs="Leelawadee UI"/>
-          <w:sz w:val="24"/>
-          <w:szCs w:val="24"/>
-        </w:rPr>
-        <w:t xml:space="preserve">•  ปิยะดา ดวงพลจันทร์ — piyadad@chememan.com</w:t>
-      </w:r>
-    </w:p>
-    <w:p>
-      <w:pPr>
-        <w:rFonts w:ascii="Leelawadee UI" w:hAnsi="Leelawadee UI" w:cs="Leelawadee UI"/>
-        <w:spacing w:before="0" w:after="50"/>
-      </w:pPr>
-      <w:r>
-        <w:rPr>
-          <w:rFonts w:ascii="Leelawadee UI" w:hAnsi="Leelawadee UI" w:cs="Leelawadee UI"/>
-          <w:sz w:val="24"/>
-          <w:szCs w:val="24"/>
-        </w:rPr>
-        <w:t xml:space="preserve">•  ทีม Data and Analytics — jakkaritw@chememan.com</w:t>
-      </w:r>
-    </w:p>
-    <w:p>
-      <w:pPr>
-        <w:rFonts w:ascii="Leelawadee UI" w:hAnsi="Leelawadee UI" w:cs="Leelawadee UI"/>
-        <w:spacing w:before="0" w:after="140"/>
-      </w:pPr>
-      <w:r>
-        <w:rPr>
-          <w:rFonts w:ascii="Leelawadee UI" w:hAnsi="Leelawadee UI" w:cs="Leelawadee UI"/>
-          <w:sz w:val="24"/>
-          <w:szCs w:val="24"/>
-        </w:rPr>
-        <w:t xml:space="preserve">การเข้าถึงและสิทธิ์แก้ไขไฟล์ควบคุมด้วยสิทธิ์ของไฟล์/โฟลเดอร์บน SharePoint (site CMANDWPRD) โดยตรง เฉพาะผู้ที่ได้รับสิทธิ์ข้างต้นเท่านั้นที่แก้ไขไฟล์ได้ ทั้งนี้ SharePoint บันทึกประวัติการแก้ไข (version history) ของไฟล์ให้อัตโนมัติ</w:t>
       </w:r>
     </w:p>
     <w:p>

</xml_diff>

<commit_message>
docs(signoff): show Spec C Data-sync block once, not per section
Same Excel->Fabric sync applies to all 6 datasets, so the Data-sync block
renders only in Spec C-1 (reworded to "ทั้ง 6 ชุดนี้"). C-6's dataset-
specific rule (blank-filler rows skipped per-row at sync) moved into its
principles bullets so it survives.

Co-Authored-By: Claude Sonnet 5 <noreply@anthropic.com>
</commit_message>
<xml_diff>
--- a/requirement_spec/1_software_dev/1.1_frontend/signoff_spec/laddawan/Spec C การจัดการตารางข้อมูลหลัก_V1.0.docx
+++ b/requirement_spec/1_software_dev/1.1_frontend/signoff_spec/laddawan/Spec C การจัดการตารางข้อมูลหลัก_V1.0.docx
@@ -745,7 +745,7 @@
           <w:sz w:val="24"/>
           <w:szCs w:val="24"/>
         </w:rPr>
-        <w:t xml:space="preserve">ข้อมูลในไฟล์ Excel นี้จะถูกซิงค์เข้าสู่คลังข้อมูลกลางบน Microsoft Fabric (workspace `cman-dw-ws`, lakehouse `modern_lh_cman_dw`) เพื่อให้ระบบงบประมาณและรายงานนำไปใช้งานจริง รอบเวลาการซิงค์และการตรวจสอบความถูกต้องของข้อมูล (validation) อยู่ระหว่างการออกแบบ</w:t>
+        <w:t xml:space="preserve">ข้อมูลในไฟล์ Excel ทั้ง 6 ชุดนี้จะถูกซิงค์เข้าสู่คลังข้อมูลกลางบน Microsoft Fabric (workspace `cman-dw-ws`, lakehouse `modern_lh_cman_dw`) เพื่อให้ระบบงบประมาณและรายงานนำไปใช้งานจริง รอบเวลาการซิงค์และการตรวจสอบความถูกต้องของข้อมูล (validation) อยู่ระหว่างการออกแบบ</w:t>
       </w:r>
     </w:p>
     <w:p>
@@ -1242,38 +1242,6 @@
     </w:p>
     <w:p>
       <w:pPr>
-        <w:rFonts w:ascii="Leelawadee UI" w:hAnsi="Leelawadee UI" w:cs="Leelawadee UI"/>
-        <w:spacing w:before="160" w:after="60"/>
-        <w:keepNext/>
-      </w:pPr>
-      <w:r>
-        <w:rPr>
-          <w:rFonts w:ascii="Leelawadee UI" w:hAnsi="Leelawadee UI" w:cs="Leelawadee UI"/>
-          <w:b/>
-          <w:bCs/>
-          <w:color w:val="1F3864"/>
-          <w:sz w:val="26"/>
-          <w:szCs w:val="26"/>
-        </w:rPr>
-        <w:t xml:space="preserve">การซิงค์ข้อมูลเข้าใช้งานจริง (Data sync)</w:t>
-      </w:r>
-    </w:p>
-    <w:p>
-      <w:pPr>
-        <w:rFonts w:ascii="Leelawadee UI" w:hAnsi="Leelawadee UI" w:cs="Leelawadee UI"/>
-        <w:spacing w:before="0" w:after="160"/>
-      </w:pPr>
-      <w:r>
-        <w:rPr>
-          <w:rFonts w:ascii="Leelawadee UI" w:hAnsi="Leelawadee UI" w:cs="Leelawadee UI"/>
-          <w:sz w:val="24"/>
-          <w:szCs w:val="24"/>
-        </w:rPr>
-        <w:t xml:space="preserve">ข้อมูลในไฟล์ Excel นี้จะถูกซิงค์เข้าสู่คลังข้อมูลกลางบน Microsoft Fabric (workspace `cman-dw-ws`, lakehouse `modern_lh_cman_dw`) เพื่อให้ระบบงบประมาณและรายงานนำไปใช้งานจริง รอบเวลาการซิงค์และการตรวจสอบความถูกต้องของข้อมูล (validation) อยู่ระหว่างการออกแบบ</w:t>
-      </w:r>
-    </w:p>
-    <w:p>
-      <w:pPr>
         <w:pageBreakBefore/>
         <w:rFonts w:ascii="Leelawadee UI" w:hAnsi="Leelawadee UI" w:cs="Leelawadee UI"/>
         <w:spacing w:before="0" w:after="120"/>
@@ -1748,38 +1716,6 @@
     </w:p>
     <w:p>
       <w:pPr>
-        <w:rFonts w:ascii="Leelawadee UI" w:hAnsi="Leelawadee UI" w:cs="Leelawadee UI"/>
-        <w:spacing w:before="160" w:after="60"/>
-        <w:keepNext/>
-      </w:pPr>
-      <w:r>
-        <w:rPr>
-          <w:rFonts w:ascii="Leelawadee UI" w:hAnsi="Leelawadee UI" w:cs="Leelawadee UI"/>
-          <w:b/>
-          <w:bCs/>
-          <w:color w:val="1F3864"/>
-          <w:sz w:val="26"/>
-          <w:szCs w:val="26"/>
-        </w:rPr>
-        <w:t xml:space="preserve">การซิงค์ข้อมูลเข้าใช้งานจริง (Data sync)</w:t>
-      </w:r>
-    </w:p>
-    <w:p>
-      <w:pPr>
-        <w:rFonts w:ascii="Leelawadee UI" w:hAnsi="Leelawadee UI" w:cs="Leelawadee UI"/>
-        <w:spacing w:before="0" w:after="160"/>
-      </w:pPr>
-      <w:r>
-        <w:rPr>
-          <w:rFonts w:ascii="Leelawadee UI" w:hAnsi="Leelawadee UI" w:cs="Leelawadee UI"/>
-          <w:sz w:val="24"/>
-          <w:szCs w:val="24"/>
-        </w:rPr>
-        <w:t xml:space="preserve">ข้อมูลในไฟล์ Excel นี้จะถูกซิงค์เข้าสู่คลังข้อมูลกลางบน Microsoft Fabric (workspace `cman-dw-ws`, lakehouse `modern_lh_cman_dw`) เพื่อให้ระบบงบประมาณและรายงานนำไปใช้งานจริง รอบเวลาการซิงค์และการตรวจสอบความถูกต้องของข้อมูล (validation) อยู่ระหว่างการออกแบบ</w:t>
-      </w:r>
-    </w:p>
-    <w:p>
-      <w:pPr>
         <w:pageBreakBefore/>
         <w:rFonts w:ascii="Leelawadee UI" w:hAnsi="Leelawadee UI" w:cs="Leelawadee UI"/>
         <w:spacing w:before="0" w:after="120"/>
@@ -2366,38 +2302,6 @@
     </w:p>
     <w:p>
       <w:pPr>
-        <w:rFonts w:ascii="Leelawadee UI" w:hAnsi="Leelawadee UI" w:cs="Leelawadee UI"/>
-        <w:spacing w:before="160" w:after="60"/>
-        <w:keepNext/>
-      </w:pPr>
-      <w:r>
-        <w:rPr>
-          <w:rFonts w:ascii="Leelawadee UI" w:hAnsi="Leelawadee UI" w:cs="Leelawadee UI"/>
-          <w:b/>
-          <w:bCs/>
-          <w:color w:val="1F3864"/>
-          <w:sz w:val="26"/>
-          <w:szCs w:val="26"/>
-        </w:rPr>
-        <w:t xml:space="preserve">การซิงค์ข้อมูลเข้าใช้งานจริง (Data sync)</w:t>
-      </w:r>
-    </w:p>
-    <w:p>
-      <w:pPr>
-        <w:rFonts w:ascii="Leelawadee UI" w:hAnsi="Leelawadee UI" w:cs="Leelawadee UI"/>
-        <w:spacing w:before="0" w:after="160"/>
-      </w:pPr>
-      <w:r>
-        <w:rPr>
-          <w:rFonts w:ascii="Leelawadee UI" w:hAnsi="Leelawadee UI" w:cs="Leelawadee UI"/>
-          <w:sz w:val="24"/>
-          <w:szCs w:val="24"/>
-        </w:rPr>
-        <w:t xml:space="preserve">ข้อมูลในไฟล์ Excel นี้จะถูกซิงค์เข้าสู่คลังข้อมูลกลางบน Microsoft Fabric (workspace `cman-dw-ws`, lakehouse `modern_lh_cman_dw`) เพื่อให้ระบบงบประมาณและรายงานนำไปใช้งานจริง รอบเวลาการซิงค์และการตรวจสอบความถูกต้องของข้อมูล (validation) อยู่ระหว่างการออกแบบ</w:t>
-      </w:r>
-    </w:p>
-    <w:p>
-      <w:pPr>
         <w:pageBreakBefore/>
         <w:rFonts w:ascii="Leelawadee UI" w:hAnsi="Leelawadee UI" w:cs="Leelawadee UI"/>
         <w:spacing w:before="0" w:after="120"/>
@@ -3432,38 +3336,6 @@
     </w:p>
     <w:p>
       <w:pPr>
-        <w:rFonts w:ascii="Leelawadee UI" w:hAnsi="Leelawadee UI" w:cs="Leelawadee UI"/>
-        <w:spacing w:before="160" w:after="60"/>
-        <w:keepNext/>
-      </w:pPr>
-      <w:r>
-        <w:rPr>
-          <w:rFonts w:ascii="Leelawadee UI" w:hAnsi="Leelawadee UI" w:cs="Leelawadee UI"/>
-          <w:b/>
-          <w:bCs/>
-          <w:color w:val="1F3864"/>
-          <w:sz w:val="26"/>
-          <w:szCs w:val="26"/>
-        </w:rPr>
-        <w:t xml:space="preserve">การซิงค์ข้อมูลเข้าใช้งานจริง (Data sync)</w:t>
-      </w:r>
-    </w:p>
-    <w:p>
-      <w:pPr>
-        <w:rFonts w:ascii="Leelawadee UI" w:hAnsi="Leelawadee UI" w:cs="Leelawadee UI"/>
-        <w:spacing w:before="0" w:after="160"/>
-      </w:pPr>
-      <w:r>
-        <w:rPr>
-          <w:rFonts w:ascii="Leelawadee UI" w:hAnsi="Leelawadee UI" w:cs="Leelawadee UI"/>
-          <w:sz w:val="24"/>
-          <w:szCs w:val="24"/>
-        </w:rPr>
-        <w:t xml:space="preserve">ข้อมูลในไฟล์ Excel นี้จะถูกซิงค์เข้าสู่คลังข้อมูลกลางบน Microsoft Fabric (workspace `cman-dw-ws`, lakehouse `modern_lh_cman_dw`) เพื่อให้ระบบงบประมาณและรายงานนำไปใช้งานจริง รอบเวลาการซิงค์และการตรวจสอบความถูกต้องของข้อมูล (validation) อยู่ระหว่างการออกแบบ</w:t>
-      </w:r>
-    </w:p>
-    <w:p>
-      <w:pPr>
         <w:pageBreakBefore/>
         <w:rFonts w:ascii="Leelawadee UI" w:hAnsi="Leelawadee UI" w:cs="Leelawadee UI"/>
         <w:spacing w:before="0" w:after="120"/>
@@ -3939,33 +3811,15 @@
     <w:p>
       <w:pPr>
         <w:rFonts w:ascii="Leelawadee UI" w:hAnsi="Leelawadee UI" w:cs="Leelawadee UI"/>
-        <w:spacing w:before="160" w:after="60"/>
-        <w:keepNext/>
-      </w:pPr>
-      <w:r>
-        <w:rPr>
-          <w:rFonts w:ascii="Leelawadee UI" w:hAnsi="Leelawadee UI" w:cs="Leelawadee UI"/>
-          <w:b/>
-          <w:bCs/>
-          <w:color w:val="1F3864"/>
-          <w:sz w:val="26"/>
-          <w:szCs w:val="26"/>
-        </w:rPr>
-        <w:t xml:space="preserve">การซิงค์ข้อมูลเข้าใช้งานจริง (Data sync)</w:t>
-      </w:r>
-    </w:p>
-    <w:p>
-      <w:pPr>
-        <w:rFonts w:ascii="Leelawadee UI" w:hAnsi="Leelawadee UI" w:cs="Leelawadee UI"/>
-        <w:spacing w:before="0" w:after="160"/>
-      </w:pPr>
-      <w:r>
-        <w:rPr>
-          <w:rFonts w:ascii="Leelawadee UI" w:hAnsi="Leelawadee UI" w:cs="Leelawadee UI"/>
-          <w:sz w:val="24"/>
-          <w:szCs w:val="24"/>
-        </w:rPr>
-        <w:t xml:space="preserve">ข้อมูลในไฟล์ Excel นี้จะถูกซิงค์เข้าสู่คลังข้อมูลกลางบน Microsoft Fabric (workspace `cman-dw-ws`, lakehouse `modern_lh_cman_dw`) เพื่อให้ระบบงบประมาณและรายงานนำไปใช้งานจริง ทั้งนี้ แถวที่เว้นช่องผู้กรอกว่างไว้จะถูกข้ามเฉพาะแถวนั้นตอนซิงค์ ส่วนแถวอื่นในไฟล์ยังซิงค์ตามปกติ รอบเวลาการซิงค์และการตรวจสอบความถูกต้องของข้อมูล (validation) อยู่ระหว่างการออกแบบ</w:t>
+        <w:spacing w:before="0" w:after="50"/>
+      </w:pPr>
+      <w:r>
+        <w:rPr>
+          <w:rFonts w:ascii="Leelawadee UI" w:hAnsi="Leelawadee UI" w:cs="Leelawadee UI"/>
+          <w:sz w:val="24"/>
+          <w:szCs w:val="24"/>
+        </w:rPr>
+        <w:t xml:space="preserve">•  ตอนซิงค์ข้อมูล แถวที่เว้นช่องผู้กรอกว่างไว้จะถูกข้ามเฉพาะแถวนั้น ส่วนแถวอื่นในไฟล์ยังซิงค์ตามปกติ</w:t>
       </w:r>
     </w:p>
     <w:p>

</xml_diff>

<commit_message>
docs(signoff): fix Spec C-2 filler wording; move shared blocks to preamble
- C-2 deadline-lock: "ผู้กรอกทั่วไป" no longer defined by L3/L4/L2 level
  (contradicted ADR-0019's no-role-check fill model); now defined as those
  listed in the Cost Center<->Filler file (Spec C-6) who aren't admins.
- Admin/editor list + Data-sync block moved out of Spec C-1 into a shared
  "ข้อมูลทั่วไป (ใช้ร่วมกับข้อมูลหลักทั้ง 6 ชุด)" preamble page before C-1,
  so a reader landing on any single section isn't missing who-can-edit /
  where-it-syncs. Both still render exactly once.

Co-Authored-By: Claude Sonnet 5 <noreply@anthropic.com>
</commit_message>
<xml_diff>
--- a/requirement_spec/1_software_dev/1.1_frontend/signoff_spec/laddawan/Spec C การจัดการตารางข้อมูลหลัก_V1.0.docx
+++ b/requirement_spec/1_software_dev/1.1_frontend/signoff_spec/laddawan/Spec C การจัดการตารางข้อมูลหลัก_V1.0.docx
@@ -171,7 +171,108 @@
           <w:sz w:val="32"/>
           <w:szCs w:val="32"/>
         </w:rPr>
-        <w:t xml:space="preserve">Spec C-1: กลุ่มรหัสบัญชี (GL Account Group)</w:t>
+        <w:t xml:space="preserve">ข้อมูลทั่วไป (ใช้ร่วมกับข้อมูลหลักทั้ง 6 ชุด)</w:t>
+      </w:r>
+    </w:p>
+    <w:p>
+      <w:pPr>
+        <w:rFonts w:ascii="Leelawadee UI" w:hAnsi="Leelawadee UI" w:cs="Leelawadee UI"/>
+        <w:spacing w:before="0" w:after="120"/>
+      </w:pPr>
+      <w:r>
+        <w:rPr>
+          <w:rFonts w:ascii="Leelawadee UI" w:hAnsi="Leelawadee UI" w:cs="Leelawadee UI"/>
+          <w:sz w:val="24"/>
+          <w:szCs w:val="24"/>
+        </w:rPr>
+        <w:t xml:space="preserve">ส่วนนี้ระบุผู้ที่มีสิทธิ์แก้ไขไฟล์และวิธีการซิงค์ข้อมูล ซึ่งใช้ร่วมกันกับข้อมูลหลักทั้ง 6 ชุด (Spec C-1 ถึง C-6) ในเอกสารนี้ รายละเอียดเฉพาะของแต่ละชุดอยู่ในหัวข้อของชุดนั้น</w:t>
+      </w:r>
+    </w:p>
+    <w:p>
+      <w:pPr>
+        <w:rFonts w:ascii="Leelawadee UI" w:hAnsi="Leelawadee UI" w:cs="Leelawadee UI"/>
+        <w:spacing w:before="100" w:after="40"/>
+      </w:pPr>
+      <w:r>
+        <w:rPr>
+          <w:rFonts w:ascii="Leelawadee UI" w:hAnsi="Leelawadee UI" w:cs="Leelawadee UI"/>
+          <w:b/>
+          <w:bCs/>
+          <w:color w:val="000000"/>
+          <w:sz w:val="24"/>
+          <w:szCs w:val="24"/>
+        </w:rPr>
+        <w:t xml:space="preserve">ผู้ที่ได้รับสิทธิ์แก้ไขไฟล์ Excel บน SharePoint (4 คน)</w:t>
+      </w:r>
+    </w:p>
+    <w:p>
+      <w:pPr>
+        <w:rFonts w:ascii="Leelawadee UI" w:hAnsi="Leelawadee UI" w:cs="Leelawadee UI"/>
+        <w:spacing w:before="0" w:after="50"/>
+      </w:pPr>
+      <w:r>
+        <w:rPr>
+          <w:rFonts w:ascii="Leelawadee UI" w:hAnsi="Leelawadee UI" w:cs="Leelawadee UI"/>
+          <w:sz w:val="24"/>
+          <w:szCs w:val="24"/>
+        </w:rPr>
+        <w:t xml:space="preserve">•  นิภาพร ทองกิ่ง — nipapornt@chememan.com</w:t>
+      </w:r>
+    </w:p>
+    <w:p>
+      <w:pPr>
+        <w:rFonts w:ascii="Leelawadee UI" w:hAnsi="Leelawadee UI" w:cs="Leelawadee UI"/>
+        <w:spacing w:before="0" w:after="50"/>
+      </w:pPr>
+      <w:r>
+        <w:rPr>
+          <w:rFonts w:ascii="Leelawadee UI" w:hAnsi="Leelawadee UI" w:cs="Leelawadee UI"/>
+          <w:sz w:val="24"/>
+          <w:szCs w:val="24"/>
+        </w:rPr>
+        <w:t xml:space="preserve">•  วราพร ติรสิทธิ์ — warapornt@chememan.com</w:t>
+      </w:r>
+    </w:p>
+    <w:p>
+      <w:pPr>
+        <w:rFonts w:ascii="Leelawadee UI" w:hAnsi="Leelawadee UI" w:cs="Leelawadee UI"/>
+        <w:spacing w:before="0" w:after="50"/>
+      </w:pPr>
+      <w:r>
+        <w:rPr>
+          <w:rFonts w:ascii="Leelawadee UI" w:hAnsi="Leelawadee UI" w:cs="Leelawadee UI"/>
+          <w:sz w:val="24"/>
+          <w:szCs w:val="24"/>
+        </w:rPr>
+        <w:t xml:space="preserve">•  ปิยะดา ดวงพลจันทร์ — piyadad@chememan.com</w:t>
+      </w:r>
+    </w:p>
+    <w:p>
+      <w:pPr>
+        <w:rFonts w:ascii="Leelawadee UI" w:hAnsi="Leelawadee UI" w:cs="Leelawadee UI"/>
+        <w:spacing w:before="0" w:after="50"/>
+      </w:pPr>
+      <w:r>
+        <w:rPr>
+          <w:rFonts w:ascii="Leelawadee UI" w:hAnsi="Leelawadee UI" w:cs="Leelawadee UI"/>
+          <w:sz w:val="24"/>
+          <w:szCs w:val="24"/>
+        </w:rPr>
+        <w:t xml:space="preserve">•  ทีม Data and Analytics — jakkaritw@chememan.com</w:t>
+      </w:r>
+    </w:p>
+    <w:p>
+      <w:pPr>
+        <w:rFonts w:ascii="Leelawadee UI" w:hAnsi="Leelawadee UI" w:cs="Leelawadee UI"/>
+        <w:spacing w:before="0" w:after="140"/>
+      </w:pPr>
+      <w:r>
+        <w:rPr>
+          <w:rFonts w:ascii="Leelawadee UI" w:hAnsi="Leelawadee UI" w:cs="Leelawadee UI"/>
+          <w:sz w:val="24"/>
+          <w:szCs w:val="24"/>
+        </w:rPr>
+        <w:t xml:space="preserve">การเข้าถึงและสิทธิ์แก้ไขไฟล์ทั้ง 6 ชุดนี้ควบคุมด้วยสิทธิ์ของไฟล์/โฟลเดอร์บน SharePoint (site CMANDWPRD) โดยตรง เฉพาะผู้ที่ได้รับสิทธิ์ข้างต้นเท่านั้นที่แก้ไขไฟล์ได้ ทั้งนี้ SharePoint บันทึกประวัติการแก้ไข (version history) ของไฟล์ให้อัตโนมัติ</w:t>
       </w:r>
     </w:p>
     <w:p>
@@ -189,108 +290,72 @@
           <w:sz w:val="26"/>
           <w:szCs w:val="26"/>
         </w:rPr>
-        <w:t xml:space="preserve">บริบทและขอบเขต (Context)</w:t>
-      </w:r>
-    </w:p>
-    <w:p>
-      <w:pPr>
+        <w:t xml:space="preserve">การซิงค์ข้อมูลเข้าใช้งานจริง (Data sync)</w:t>
+      </w:r>
+    </w:p>
+    <w:p>
+      <w:pPr>
+        <w:rFonts w:ascii="Leelawadee UI" w:hAnsi="Leelawadee UI" w:cs="Leelawadee UI"/>
+        <w:spacing w:before="0" w:after="160"/>
+      </w:pPr>
+      <w:r>
+        <w:rPr>
+          <w:rFonts w:ascii="Leelawadee UI" w:hAnsi="Leelawadee UI" w:cs="Leelawadee UI"/>
+          <w:sz w:val="24"/>
+          <w:szCs w:val="24"/>
+        </w:rPr>
+        <w:t xml:space="preserve">ข้อมูลในไฟล์ Excel ทั้ง 6 ชุดนี้จะถูกซิงค์เข้าสู่คลังข้อมูลกลางบน Microsoft Fabric (workspace `cman-dw-ws`, lakehouse `modern_lh_cman_dw`) เพื่อให้ระบบงบประมาณและรายงานนำไปใช้งานจริง รอบเวลาการซิงค์และการตรวจสอบความถูกต้องของข้อมูล (validation) อยู่ระหว่างการออกแบบ</w:t>
+      </w:r>
+    </w:p>
+    <w:p>
+      <w:pPr>
+        <w:pageBreakBefore/>
         <w:rFonts w:ascii="Leelawadee UI" w:hAnsi="Leelawadee UI" w:cs="Leelawadee UI"/>
         <w:spacing w:before="0" w:after="120"/>
-      </w:pPr>
-      <w:r>
-        <w:rPr>
-          <w:rFonts w:ascii="Leelawadee UI" w:hAnsi="Leelawadee UI" w:cs="Leelawadee UI"/>
-          <w:sz w:val="24"/>
-          <w:szCs w:val="24"/>
-        </w:rPr>
-        <w:t xml:space="preserve">ข้อมูลชุดนี้ใช้จับคู่รหัสบัญชี (GL Code ซึ่งอ้างอิงจาก SAP) เข้ากับกลุ่มรหัสบัญชี (GL Group) เพื่อจัดหมวดหมู่รายการบัญชีในรายงานงบประมาณ ผู้ดูแลระบบดูแลข้อมูลนี้ผ่าน ไฟล์ Excel หนึ่งไฟล์บน SharePoint</w:t>
-      </w:r>
-    </w:p>
-    <w:p>
-      <w:pPr>
-        <w:rFonts w:ascii="Leelawadee UI" w:hAnsi="Leelawadee UI" w:cs="Leelawadee UI"/>
-        <w:spacing w:before="100" w:after="40"/>
+        <w:keepNext/>
       </w:pPr>
       <w:r>
         <w:rPr>
           <w:rFonts w:ascii="Leelawadee UI" w:hAnsi="Leelawadee UI" w:cs="Leelawadee UI"/>
           <w:b/>
           <w:bCs/>
-          <w:color w:val="000000"/>
-          <w:sz w:val="24"/>
-          <w:szCs w:val="24"/>
-        </w:rPr>
-        <w:t xml:space="preserve">ผู้ที่ได้รับสิทธิ์แก้ไขไฟล์ Excel บน SharePoint (4 คน)</w:t>
-      </w:r>
-    </w:p>
-    <w:p>
-      <w:pPr>
-        <w:rFonts w:ascii="Leelawadee UI" w:hAnsi="Leelawadee UI" w:cs="Leelawadee UI"/>
-        <w:spacing w:before="0" w:after="50"/>
-      </w:pPr>
-      <w:r>
-        <w:rPr>
-          <w:rFonts w:ascii="Leelawadee UI" w:hAnsi="Leelawadee UI" w:cs="Leelawadee UI"/>
-          <w:sz w:val="24"/>
-          <w:szCs w:val="24"/>
-        </w:rPr>
-        <w:t xml:space="preserve">•  นิภาพร ทองกิ่ง — nipapornt@chememan.com</w:t>
-      </w:r>
-    </w:p>
-    <w:p>
-      <w:pPr>
-        <w:rFonts w:ascii="Leelawadee UI" w:hAnsi="Leelawadee UI" w:cs="Leelawadee UI"/>
-        <w:spacing w:before="0" w:after="50"/>
-      </w:pPr>
-      <w:r>
-        <w:rPr>
-          <w:rFonts w:ascii="Leelawadee UI" w:hAnsi="Leelawadee UI" w:cs="Leelawadee UI"/>
-          <w:sz w:val="24"/>
-          <w:szCs w:val="24"/>
-        </w:rPr>
-        <w:t xml:space="preserve">•  วราพร ติรสิทธิ์ — warapornt@chememan.com</w:t>
-      </w:r>
-    </w:p>
-    <w:p>
-      <w:pPr>
-        <w:rFonts w:ascii="Leelawadee UI" w:hAnsi="Leelawadee UI" w:cs="Leelawadee UI"/>
-        <w:spacing w:before="0" w:after="50"/>
-      </w:pPr>
-      <w:r>
-        <w:rPr>
-          <w:rFonts w:ascii="Leelawadee UI" w:hAnsi="Leelawadee UI" w:cs="Leelawadee UI"/>
-          <w:sz w:val="24"/>
-          <w:szCs w:val="24"/>
-        </w:rPr>
-        <w:t xml:space="preserve">•  ปิยะดา ดวงพลจันทร์ — piyadad@chememan.com</w:t>
-      </w:r>
-    </w:p>
-    <w:p>
-      <w:pPr>
-        <w:rFonts w:ascii="Leelawadee UI" w:hAnsi="Leelawadee UI" w:cs="Leelawadee UI"/>
-        <w:spacing w:before="0" w:after="50"/>
-      </w:pPr>
-      <w:r>
-        <w:rPr>
-          <w:rFonts w:ascii="Leelawadee UI" w:hAnsi="Leelawadee UI" w:cs="Leelawadee UI"/>
-          <w:sz w:val="24"/>
-          <w:szCs w:val="24"/>
-        </w:rPr>
-        <w:t xml:space="preserve">•  ทีม Data and Analytics — jakkaritw@chememan.com</w:t>
-      </w:r>
-    </w:p>
-    <w:p>
-      <w:pPr>
-        <w:rFonts w:ascii="Leelawadee UI" w:hAnsi="Leelawadee UI" w:cs="Leelawadee UI"/>
-        <w:spacing w:before="0" w:after="140"/>
-      </w:pPr>
-      <w:r>
-        <w:rPr>
-          <w:rFonts w:ascii="Leelawadee UI" w:hAnsi="Leelawadee UI" w:cs="Leelawadee UI"/>
-          <w:sz w:val="24"/>
-          <w:szCs w:val="24"/>
-        </w:rPr>
-        <w:t xml:space="preserve">การเข้าถึงและสิทธิ์แก้ไขไฟล์ทั้ง 6 ชุดนี้ควบคุมด้วยสิทธิ์ของไฟล์/โฟลเดอร์บน SharePoint (site CMANDWPRD) โดยตรง เฉพาะผู้ที่ได้รับสิทธิ์ข้างต้นเท่านั้นที่แก้ไขไฟล์ได้ ทั้งนี้ SharePoint บันทึกประวัติการแก้ไข (version history) ของไฟล์ให้อัตโนมัติ</w:t>
+          <w:color w:val="0F4761"/>
+          <w:sz w:val="32"/>
+          <w:szCs w:val="32"/>
+        </w:rPr>
+        <w:t xml:space="preserve">Spec C-1: กลุ่มรหัสบัญชี (GL Account Group)</w:t>
+      </w:r>
+    </w:p>
+    <w:p>
+      <w:pPr>
+        <w:rFonts w:ascii="Leelawadee UI" w:hAnsi="Leelawadee UI" w:cs="Leelawadee UI"/>
+        <w:spacing w:before="160" w:after="60"/>
+        <w:keepNext/>
+      </w:pPr>
+      <w:r>
+        <w:rPr>
+          <w:rFonts w:ascii="Leelawadee UI" w:hAnsi="Leelawadee UI" w:cs="Leelawadee UI"/>
+          <w:b/>
+          <w:bCs/>
+          <w:color w:val="1F3864"/>
+          <w:sz w:val="26"/>
+          <w:szCs w:val="26"/>
+        </w:rPr>
+        <w:t xml:space="preserve">บริบทและขอบเขต (Context)</w:t>
+      </w:r>
+    </w:p>
+    <w:p>
+      <w:pPr>
+        <w:rFonts w:ascii="Leelawadee UI" w:hAnsi="Leelawadee UI" w:cs="Leelawadee UI"/>
+        <w:spacing w:before="0" w:after="120"/>
+      </w:pPr>
+      <w:r>
+        <w:rPr>
+          <w:rFonts w:ascii="Leelawadee UI" w:hAnsi="Leelawadee UI" w:cs="Leelawadee UI"/>
+          <w:sz w:val="24"/>
+          <w:szCs w:val="24"/>
+        </w:rPr>
+        <w:t xml:space="preserve">ข้อมูลชุดนี้ใช้จับคู่รหัสบัญชี (GL Code ซึ่งอ้างอิงจาก SAP) เข้ากับกลุ่มรหัสบัญชี (GL Group) เพื่อจัดหมวดหมู่รายการบัญชีในรายงานงบประมาณ ผู้ดูแลระบบดูแลข้อมูลนี้ผ่าน ไฟล์ Excel หนึ่งไฟล์บน SharePoint</w:t>
       </w:r>
     </w:p>
     <w:p>
@@ -718,38 +783,6 @@
     </w:p>
     <w:p>
       <w:pPr>
-        <w:rFonts w:ascii="Leelawadee UI" w:hAnsi="Leelawadee UI" w:cs="Leelawadee UI"/>
-        <w:spacing w:before="160" w:after="60"/>
-        <w:keepNext/>
-      </w:pPr>
-      <w:r>
-        <w:rPr>
-          <w:rFonts w:ascii="Leelawadee UI" w:hAnsi="Leelawadee UI" w:cs="Leelawadee UI"/>
-          <w:b/>
-          <w:bCs/>
-          <w:color w:val="1F3864"/>
-          <w:sz w:val="26"/>
-          <w:szCs w:val="26"/>
-        </w:rPr>
-        <w:t xml:space="preserve">การซิงค์ข้อมูลเข้าใช้งานจริง (Data sync)</w:t>
-      </w:r>
-    </w:p>
-    <w:p>
-      <w:pPr>
-        <w:rFonts w:ascii="Leelawadee UI" w:hAnsi="Leelawadee UI" w:cs="Leelawadee UI"/>
-        <w:spacing w:before="0" w:after="160"/>
-      </w:pPr>
-      <w:r>
-        <w:rPr>
-          <w:rFonts w:ascii="Leelawadee UI" w:hAnsi="Leelawadee UI" w:cs="Leelawadee UI"/>
-          <w:sz w:val="24"/>
-          <w:szCs w:val="24"/>
-        </w:rPr>
-        <w:t xml:space="preserve">ข้อมูลในไฟล์ Excel ทั้ง 6 ชุดนี้จะถูกซิงค์เข้าสู่คลังข้อมูลกลางบน Microsoft Fabric (workspace `cman-dw-ws`, lakehouse `modern_lh_cman_dw`) เพื่อให้ระบบงบประมาณและรายงานนำไปใช้งานจริง รอบเวลาการซิงค์และการตรวจสอบความถูกต้องของข้อมูล (validation) อยู่ระหว่างการออกแบบ</w:t>
-      </w:r>
-    </w:p>
-    <w:p>
-      <w:pPr>
         <w:pageBreakBefore/>
         <w:rFonts w:ascii="Leelawadee UI" w:hAnsi="Leelawadee UI" w:cs="Leelawadee UI"/>
         <w:spacing w:before="0" w:after="120"/>
@@ -1223,7 +1256,7 @@
           <w:sz w:val="24"/>
           <w:szCs w:val="24"/>
         </w:rPr>
-        <w:t xml:space="preserve">เมื่อถึงวันปิดรับของปีนั้น ระบบจะล็อกฟอร์มกรอกงบประมาณ (Submit Budget Form) ให้เป็นอ่านอย่างเดียวสำหรับผู้กรอกทั่วไป (ระดับ L3/L4 และ L2 จำนวน 3 คน) ไม่ให้กรอกหรือแก้ไขเพิ่มเติม</w:t>
+        <w:t xml:space="preserve">เมื่อถึงวันปิดรับของปีนั้น ระบบจะล็อกฟอร์มกรอกงบประมาณ (Submit Budget Form) ให้เป็นอ่านอย่างเดียวสำหรับผู้กรอกทั่วไป (ผู้ที่ถูกกำหนดเป็นผู้กรอกในไฟล์ Cost Center ↔ ผู้กรอก ตาม Spec C-6 และไม่ใช่ผู้ดูแลระบบ) ไม่ให้กรอกหรือแก้ไขเพิ่มเติม</w:t>
       </w:r>
     </w:p>
     <w:p>

</xml_diff>

<commit_message>
docs(signoff): drop redundant per-section edit-note; simplify C-6 empty-CC line
- Removed the trailing "ผู้ดูแลระบบดูแลข้อมูลนี้ผ่านไฟล์ Excel บน SharePoint"
  sentence from every section's Context (C-1..C-6) — the shared preamble +
  cover note already state it, so per-section repeats were redundant.
- C-6 empty-Cost-Center bullet: dropped the "Admin fallback" clause per
  request; now reads "...จะไม่มีผู้รับผิดชอบ — ไม่มีใครกรอก/มองเห็นได้
  จนกว่าจะเพิ่มอีเมลผู้กรอก". (ADR-0019 remains the technical record of the
  admin-fallback behavior.)

Co-Authored-By: Claude Sonnet 5 <noreply@anthropic.com>
</commit_message>
<xml_diff>
--- a/requirement_spec/1_software_dev/1.1_frontend/signoff_spec/laddawan/Spec C การจัดการตารางข้อมูลหลัก_V1.0.docx
+++ b/requirement_spec/1_software_dev/1.1_frontend/signoff_spec/laddawan/Spec C การจัดการตารางข้อมูลหลัก_V1.0.docx
@@ -355,7 +355,7 @@
           <w:sz w:val="24"/>
           <w:szCs w:val="24"/>
         </w:rPr>
-        <w:t xml:space="preserve">ข้อมูลชุดนี้ใช้จับคู่รหัสบัญชี (GL Code ซึ่งอ้างอิงจาก SAP) เข้ากับกลุ่มรหัสบัญชี (GL Group) เพื่อจัดหมวดหมู่รายการบัญชีในรายงานงบประมาณ ผู้ดูแลระบบดูแลข้อมูลนี้ผ่าน ไฟล์ Excel หนึ่งไฟล์บน SharePoint</w:t>
+        <w:t xml:space="preserve">ข้อมูลชุดนี้ใช้จับคู่รหัสบัญชี (GL Code ซึ่งอ้างอิงจาก SAP) เข้ากับกลุ่มรหัสบัญชี (GL Group) เพื่อจัดหมวดหมู่รายการบัญชีในรายงานงบประมาณ</w:t>
       </w:r>
     </w:p>
     <w:p>
@@ -829,7 +829,7 @@
           <w:sz w:val="24"/>
           <w:szCs w:val="24"/>
         </w:rPr>
-        <w:t xml:space="preserve">ข้อมูลชุดนี้ใช้กำหนดวันปิดรับข้อมูลงบประมาณของแต่ละปีงบประมาณ โดยกำหนดได้ปีละ 1 วัน วันปิดรับไม่ตายตัวและเปลี่ยนแปลงได้ทุกปีตามแผนการจัดทำงบประมาณ ผู้ดูแลระบบดูแลข้อมูลนี้ ผ่านไฟล์ Excel หนึ่งไฟล์บน SharePoint</w:t>
+        <w:t xml:space="preserve">ข้อมูลชุดนี้ใช้กำหนดวันปิดรับข้อมูลงบประมาณของแต่ละปีงบประมาณ โดยกำหนดได้ปีละ 1 วัน วันปิดรับไม่ตายตัวและเปลี่ยนแปลงได้ทุกปีตามแผนการจัดทำงบประมาณ</w:t>
       </w:r>
     </w:p>
     <w:p>
@@ -1321,7 +1321,7 @@
           <w:sz w:val="24"/>
           <w:szCs w:val="24"/>
         </w:rPr>
-        <w:t xml:space="preserve">ข้อมูลชุดนี้เป็นการจับคู่หน่วยงาน (Orgcode) กับ Cost Center แบบหลายต่อหลาย (many-to-many) ใช้เป็นข้อมูลอ้างอิงเชิงองค์กร (organizational reference) สำหรับการจัดกลุ่ม และอ้างอิงหน่วยงานในรายงานงบประมาณ ผู้ดูแลระบบดูแลข้อมูลนี้ผ่านไฟล์ Excel หนึ่งไฟล์บน SharePoint</w:t>
+        <w:t xml:space="preserve">ข้อมูลชุดนี้เป็นการจับคู่หน่วยงาน (Orgcode) กับ Cost Center แบบหลายต่อหลาย (many-to-many) ใช้เป็นข้อมูลอ้างอิงเชิงองค์กร (organizational reference) สำหรับการจัดกลุ่ม และอ้างอิงหน่วยงานในรายงานงบประมาณ</w:t>
       </w:r>
     </w:p>
     <w:p>
@@ -1795,7 +1795,7 @@
           <w:sz w:val="24"/>
           <w:szCs w:val="24"/>
         </w:rPr>
-        <w:t xml:space="preserve">ข้อมูลชุดนี้ใช้กำหนดว่าเลขที่เอกสาร SAP รายการใด ในงวดใด (ปี + เดือน) ที่ไม่ต้องการให้นับรวม ในยอด Actuals ของรายงานงบประมาณและ Dashboard ตัวอย่างการใช้งาน เช่น งวดที่ปิดบัญชีแล้ว รายการที่อยู่ระหว่างการตรวจสอบ หรือรายการปรับปรุงที่ไม่ควรนำมาเปรียบเทียบกับงบประมาณ ผู้ดูแลระบบดูแลข้อมูลนี้ผ่านไฟล์ Excel หนึ่งไฟล์บน SharePoint</w:t>
+        <w:t xml:space="preserve">ข้อมูลชุดนี้ใช้กำหนดว่าเลขที่เอกสาร SAP รายการใด ในงวดใด (ปี + เดือน) ที่ไม่ต้องการให้นับรวม ในยอด Actuals ของรายงานงบประมาณและ Dashboard ตัวอย่างการใช้งาน เช่น งวดที่ปิดบัญชีแล้ว รายการที่อยู่ระหว่างการตรวจสอบ หรือรายการปรับปรุงที่ไม่ควรนำมาเปรียบเทียบกับงบประมาณ</w:t>
       </w:r>
     </w:p>
     <w:p>
@@ -2381,7 +2381,7 @@
           <w:sz w:val="24"/>
           <w:szCs w:val="24"/>
         </w:rPr>
-        <w:t xml:space="preserve">ข้อมูลชุดนี้ใช้กำหนดอัตราแลกเปลี่ยนเฉลี่ยรายปี (USD → THB) โดยกำหนดได้ปีละ 1 ค่า เพื่อนำไปคำนวณเบี้ยเลี้ยงการเดินทางต่างประเทศในกลุ่มค่าใช้จ่าย Travelling Expense ผู้ดูแลระบบดูแลข้อมูลนี้ผ่านไฟล์ Excel หนึ่งไฟล์บน SharePoint</w:t>
+        <w:t xml:space="preserve">ข้อมูลชุดนี้ใช้กำหนดอัตราแลกเปลี่ยนเฉลี่ยรายปี (USD → THB) โดยกำหนดได้ปีละ 1 ค่า เพื่อนำไปคำนวณเบี้ยเลี้ยงการเดินทางต่างประเทศในกลุ่มค่าใช้จ่าย Travelling Expense</w:t>
       </w:r>
     </w:p>
     <w:p>
@@ -3415,7 +3415,7 @@
           <w:sz w:val="24"/>
           <w:szCs w:val="24"/>
         </w:rPr>
-        <w:t xml:space="preserve">ข้อมูลชุดนี้กำหนดว่าแต่ละ Cost Center ใครมีสิทธิ์กรอก (fill) ข้อมูลงบประมาณของ Cost Center นั้น และใครมีสิทธิ์มองเห็น (see) เป็นแหล่งข้อมูลเดียว (single source of truth) สำหรับสิทธิ์ การมองเห็นและการกรอกข้อมูลในระบบงบประมาณหลัก การถูกระบุเป็นผู้กรอกของ Cost Center ใด จะได้สิทธิ์กรอกของ Cost Center นั้นโดยตรง ไม่มีการตรวจสอบระดับตำแหน่งหรือ role เพิ่มเติม ผู้ดูแลระบบดูแลข้อมูลนี้ผ่านไฟล์ Excel หนึ่งไฟล์บน SharePoint</w:t>
+        <w:t xml:space="preserve">ข้อมูลชุดนี้กำหนดว่าแต่ละ Cost Center ใครมีสิทธิ์กรอก (fill) ข้อมูลงบประมาณของ Cost Center นั้น และใครมีสิทธิ์มองเห็น (see) เป็นแหล่งข้อมูลเดียว (single source of truth) สำหรับสิทธิ์ การมองเห็นและการกรอกข้อมูลในระบบงบประมาณหลัก การถูกระบุเป็นผู้กรอกของ Cost Center ใด จะได้สิทธิ์กรอกของ Cost Center นั้นโดยตรง ไม่มีการตรวจสอบระดับตำแหน่งหรือ role เพิ่มเติม</w:t>
       </w:r>
     </w:p>
     <w:p>
@@ -3824,7 +3824,7 @@
           <w:sz w:val="24"/>
           <w:szCs w:val="24"/>
         </w:rPr>
-        <w:t xml:space="preserve">•  Cost Center ที่ไม่มีผู้กรอกเลย จะตกไปที่ผู้ดูแลระบบ (Admin fallback) เช่นเดียวกับหน่วยงาน ที่ไม่มีผู้รับผิดชอบ — ไม่มีใครกรอก/มองเห็นได้จนกว่าจะเพิ่มอีเมลผู้กรอกลงในแถวนั้น</w:t>
+        <w:t xml:space="preserve">•  Cost Center ที่ไม่มีผู้กรอกเลย จะไม่มีผู้รับผิดชอบ — ไม่มีใครกรอก/มองเห็นได้จนกว่าจะเพิ่มอีเมลผู้กรอกลงในแถวนั้น</w:t>
       </w:r>
     </w:p>
     <w:p>

</xml_diff>